<commit_message>
Fix deck/doc/figure font names (weight-specific families), 5.2ns P&R and 1024-angle RMCM results (§221)
Co-Authored-By: Claude Sonnet 5.5 <noreply@anthropic.com>
Claude-Session: https://claude.ai/code/session_017w9Wz8TNpiESdat1g61ZHB
</commit_message>
<xml_diff>
--- a/submission/REDRED_제출설명_1쪽.docx
+++ b/submission/REDRED_제출설명_1쪽.docx
@@ -8,7 +8,8 @@
       </w:pPr>
       <w:r>
         <w:rPr>
-          <w:b/>
+          <w:rFonts w:ascii="나눔스퀘어 네오 Bold" w:hAnsi="나눔스퀘어 네오 Bold" w:eastAsia="나눔스퀘어 네오 Bold"/>
+          <w:b w:val="0"/>
           <w:color w:val="0066CC"/>
           <w:sz w:val="30"/>
         </w:rPr>
@@ -21,6 +22,7 @@
       </w:pPr>
       <w:r>
         <w:rPr>
+          <w:rFonts w:ascii="나눔스퀘어 네오 Regular" w:hAnsi="나눔스퀘어 네오 Regular" w:eastAsia="나눔스퀘어 네오 Regular"/>
           <w:b w:val="0"/>
           <w:color w:val="5B6B76"/>
           <w:sz w:val="22"/>
@@ -50,7 +52,8 @@
             <w:r/>
             <w:r>
               <w:rPr>
-                <w:b/>
+                <w:rFonts w:ascii="나눔스퀘어 네오 Bold" w:hAnsi="나눔스퀘어 네오 Bold" w:eastAsia="나눔스퀘어 네오 Bold"/>
+                <w:b w:val="0"/>
                 <w:sz w:val="18"/>
               </w:rPr>
               <w:t>항목</w:t>
@@ -68,7 +71,8 @@
             <w:r/>
             <w:r>
               <w:rPr>
-                <w:b/>
+                <w:rFonts w:ascii="나눔스퀘어 네오 Bold" w:hAnsi="나눔스퀘어 네오 Bold" w:eastAsia="나눔스퀘어 네오 Bold"/>
+                <w:b w:val="0"/>
                 <w:sz w:val="18"/>
               </w:rPr>
               <w:t>내용</w:t>
@@ -88,6 +92,8 @@
             <w:r/>
             <w:r>
               <w:rPr>
+                <w:rFonts w:ascii="나눔스퀘어 네오 Regular" w:hAnsi="나눔스퀘어 네오 Regular" w:eastAsia="나눔스퀘어 네오 Regular"/>
+                <w:b w:val="0"/>
                 <w:sz w:val="18"/>
               </w:rPr>
               <w:t>ID</w:t>
@@ -105,6 +111,8 @@
             <w:r/>
             <w:r>
               <w:rPr>
+                <w:rFonts w:ascii="나눔스퀘어 네오 Regular" w:hAnsi="나눔스퀘어 네오 Regular" w:eastAsia="나눔스퀘어 네오 Regular"/>
+                <w:b w:val="0"/>
                 <w:sz w:val="18"/>
               </w:rPr>
               <w:t>aiasic26911</w:t>
@@ -124,6 +132,8 @@
             <w:r/>
             <w:r>
               <w:rPr>
+                <w:rFonts w:ascii="나눔스퀘어 네오 Regular" w:hAnsi="나눔스퀘어 네오 Regular" w:eastAsia="나눔스퀘어 네오 Regular"/>
+                <w:b w:val="0"/>
                 <w:sz w:val="18"/>
               </w:rPr>
               <w:t>팀명</w:t>
@@ -141,6 +151,8 @@
             <w:r/>
             <w:r>
               <w:rPr>
+                <w:rFonts w:ascii="나눔스퀘어 네오 Regular" w:hAnsi="나눔스퀘어 네오 Regular" w:eastAsia="나눔스퀘어 네오 Regular"/>
+                <w:b w:val="0"/>
                 <w:sz w:val="18"/>
               </w:rPr>
               <w:t>REDRED (서울대학교 전기정보공학부 3인)</w:t>
@@ -160,6 +172,8 @@
             <w:r/>
             <w:r>
               <w:rPr>
+                <w:rFonts w:ascii="나눔스퀘어 네오 Regular" w:hAnsi="나눔스퀘어 네오 Regular" w:eastAsia="나눔스퀘어 네오 Regular"/>
+                <w:b w:val="0"/>
                 <w:sz w:val="18"/>
               </w:rPr>
               <w:t>과제명</w:t>
@@ -177,6 +191,8 @@
             <w:r/>
             <w:r>
               <w:rPr>
+                <w:rFonts w:ascii="나눔스퀘어 네오 Regular" w:hAnsi="나눔스퀘어 네오 Regular" w:eastAsia="나눔스퀘어 네오 Regular"/>
+                <w:b w:val="0"/>
                 <w:sz w:val="18"/>
               </w:rPr>
               <w:t>회전하는 이벤트 카메라를 하나의 월드 지도로 옮기는 저전력 회로 (좌표 변환 + 월드 메모리)</w:t>
@@ -196,6 +212,8 @@
             <w:r/>
             <w:r>
               <w:rPr>
+                <w:rFonts w:ascii="나눔스퀘어 네오 Regular" w:hAnsi="나눔스퀘어 네오 Regular" w:eastAsia="나눔스퀘어 네오 Regular"/>
+                <w:b w:val="0"/>
                 <w:sz w:val="18"/>
               </w:rPr>
               <w:t>제출물</w:t>
@@ -213,6 +231,8 @@
             <w:r/>
             <w:r>
               <w:rPr>
+                <w:rFonts w:ascii="나눔스퀘어 네오 Regular" w:hAnsi="나눔스퀘어 네오 Regular" w:eastAsia="나눔스퀘어 네오 Regular"/>
+                <w:b w:val="0"/>
                 <w:sz w:val="18"/>
               </w:rPr>
               <w:t>① 발표자료 PPT(19쪽)  ② 발표 영상(10분)  ③ 본 설명 1쪽</w:t>
@@ -227,6 +247,7 @@
       </w:pPr>
       <w:r>
         <w:rPr>
+          <w:rFonts w:ascii="나눔스퀘어 네오 Regular" w:hAnsi="나눔스퀘어 네오 Regular" w:eastAsia="나눔스퀘어 네오 Regular"/>
           <w:b w:val="0"/>
           <w:sz w:val="8"/>
         </w:rPr>
@@ -238,7 +259,8 @@
       </w:pPr>
       <w:r>
         <w:rPr>
-          <w:b/>
+          <w:rFonts w:ascii="나눔스퀘어 네오 Bold" w:hAnsi="나눔스퀘어 네오 Bold" w:eastAsia="나눔스퀘어 네오 Bold"/>
+          <w:b w:val="0"/>
           <w:color w:val="1B2630"/>
           <w:sz w:val="23"/>
         </w:rPr>
@@ -267,7 +289,8 @@
             <w:r/>
             <w:r>
               <w:rPr>
-                <w:b/>
+                <w:rFonts w:ascii="나눔스퀘어 네오 Bold" w:hAnsi="나눔스퀘어 네오 Bold" w:eastAsia="나눔스퀘어 네오 Bold"/>
+                <w:b w:val="0"/>
                 <w:sz w:val="18"/>
               </w:rPr>
               <w:t>폴더 / 파일</w:t>
@@ -285,7 +308,8 @@
             <w:r/>
             <w:r>
               <w:rPr>
-                <w:b/>
+                <w:rFonts w:ascii="나눔스퀘어 네오 Bold" w:hAnsi="나눔스퀘어 네오 Bold" w:eastAsia="나눔스퀘어 네오 Bold"/>
+                <w:b w:val="0"/>
                 <w:sz w:val="18"/>
               </w:rPr>
               <w:t>내용</w:t>
@@ -305,6 +329,8 @@
             <w:r/>
             <w:r>
               <w:rPr>
+                <w:rFonts w:ascii="나눔스퀘어 네오 Regular" w:hAnsi="나눔스퀘어 네오 Regular" w:eastAsia="나눔스퀘어 네오 Regular"/>
+                <w:b w:val="0"/>
                 <w:sz w:val="18"/>
               </w:rPr>
               <w:t>submission/</w:t>
@@ -322,6 +348,8 @@
             <w:r/>
             <w:r>
               <w:rPr>
+                <w:rFonts w:ascii="나눔스퀘어 네오 Regular" w:hAnsi="나눔스퀘어 네오 Regular" w:eastAsia="나눔스퀘어 네오 Regular"/>
+                <w:b w:val="0"/>
                 <w:sz w:val="18"/>
               </w:rPr>
               <w:t>제출 파일: 발표자료 .pptx, 발표 영상, 본 설명서, 그림 생성 스크립트(figgen/)</w:t>
@@ -341,6 +369,8 @@
             <w:r/>
             <w:r>
               <w:rPr>
+                <w:rFonts w:ascii="나눔스퀘어 네오 Regular" w:hAnsi="나눔스퀘어 네오 Regular" w:eastAsia="나눔스퀘어 네오 Regular"/>
+                <w:b w:val="0"/>
                 <w:sz w:val="18"/>
               </w:rPr>
               <w:t>rtl/</w:t>
@@ -358,6 +388,8 @@
             <w:r/>
             <w:r>
               <w:rPr>
+                <w:rFonts w:ascii="나눔스퀘어 네오 Regular" w:hAnsi="나눔스퀘어 네오 Regular" w:eastAsia="나눔스퀘어 네오 Regular"/>
+                <w:b w:val="0"/>
                 <w:sz w:val="18"/>
               </w:rPr>
               <w:t>합성 가능한 RTL. 최상위 aer_tx16_coord_transform_v1_rg.v(행 클록 게이팅 메모리) 및 _blink.v(유휴 클록 차단). 좌표 변환 coord_transform_rmcm.v, 쓰기 경로 world_mem_writer.v, 메모리 world_mem_ff_rg.v, 회전각 추정기 bayes_filter.v</w:t>
@@ -377,6 +409,8 @@
             <w:r/>
             <w:r>
               <w:rPr>
+                <w:rFonts w:ascii="나눔스퀘어 네오 Regular" w:hAnsi="나눔스퀘어 네오 Regular" w:eastAsia="나눔스퀘어 네오 Regular"/>
+                <w:b w:val="0"/>
                 <w:sz w:val="18"/>
               </w:rPr>
               <w:t>tb/</w:t>
@@ -394,6 +428,8 @@
             <w:r/>
             <w:r>
               <w:rPr>
+                <w:rFonts w:ascii="나눔스퀘어 네오 Regular" w:hAnsi="나눔스퀘어 네오 Regular" w:eastAsia="나눔스퀘어 네오 Regular"/>
+                <w:b w:val="0"/>
                 <w:sz w:val="18"/>
               </w:rPr>
               <w:t>테스트벤치. tb_aer_tx16_coord_transform_v1_uzh_trace.v(실제 UZH 이벤트 8,503개), _correctness.v(무작위 스트레스), tb_coord_transform_rmcm_correctness.v(전수 16,384), tb_world_mem_ff_rg.v, tb_blink.v, tb_bayes_filter_uzh_trace.v</w:t>
@@ -413,6 +449,8 @@
             <w:r/>
             <w:r>
               <w:rPr>
+                <w:rFonts w:ascii="나눔스퀘어 네오 Regular" w:hAnsi="나눔스퀘어 네오 Regular" w:eastAsia="나눔스퀘어 네오 Regular"/>
+                <w:b w:val="0"/>
                 <w:sz w:val="18"/>
               </w:rPr>
               <w:t>syn/</w:t>
@@ -430,6 +468,8 @@
             <w:r/>
             <w:r>
               <w:rPr>
+                <w:rFonts w:ascii="나눔스퀘어 네오 Regular" w:hAnsi="나눔스퀘어 네오 Regular" w:eastAsia="나눔스퀘어 네오 Regular"/>
+                <w:b w:val="0"/>
                 <w:sz w:val="18"/>
               </w:rPr>
               <w:t>Genus 합성·Innovus P&amp;R 스크립트(syn/pnr/flow_signoff/), 합성·타이밍·전력 리포트(syn/reports/)</w:t>
@@ -449,6 +489,8 @@
             <w:r/>
             <w:r>
               <w:rPr>
+                <w:rFonts w:ascii="나눔스퀘어 네오 Regular" w:hAnsi="나눔스퀘어 네오 Regular" w:eastAsia="나눔스퀘어 네오 Regular"/>
+                <w:b w:val="0"/>
                 <w:sz w:val="18"/>
               </w:rPr>
               <w:t>scripts/</w:t>
@@ -466,6 +508,8 @@
             <w:r/>
             <w:r>
               <w:rPr>
+                <w:rFonts w:ascii="나눔스퀘어 네오 Regular" w:hAnsi="나눔스퀘어 네오 Regular" w:eastAsia="나눔스퀘어 네오 Regular"/>
+                <w:b w:val="0"/>
                 <w:sz w:val="18"/>
               </w:rPr>
               <w:t>소프트웨어 기준 모델과 검증 스크립트: coord_transform_model.py(오라클), rotation_estimate_model.py, delta_*.py, uzh_*.py 등</w:t>
@@ -485,6 +529,8 @@
             <w:r/>
             <w:r>
               <w:rPr>
+                <w:rFonts w:ascii="나눔스퀘어 네오 Regular" w:hAnsi="나눔스퀘어 네오 Regular" w:eastAsia="나눔스퀘어 네오 Regular"/>
+                <w:b w:val="0"/>
                 <w:sz w:val="18"/>
               </w:rPr>
               <w:t>common_traces_*/, results_delta/</w:t>
@@ -502,6 +548,8 @@
             <w:r/>
             <w:r>
               <w:rPr>
+                <w:rFonts w:ascii="나눔스퀘어 네오 Regular" w:hAnsi="나눔스퀘어 네오 Regular" w:eastAsia="나눔스퀘어 네오 Regular"/>
+                <w:b w:val="0"/>
                 <w:sz w:val="18"/>
               </w:rPr>
               <w:t>시뮬레이션 입력 트레이스(실제 센서 영상에서 추출)와 결과 그림(월드 지도, 3D 점구름 등)</w:t>
@@ -521,6 +569,8 @@
             <w:r/>
             <w:r>
               <w:rPr>
+                <w:rFonts w:ascii="나눔스퀘어 네오 Regular" w:hAnsi="나눔스퀘어 네오 Regular" w:eastAsia="나눔스퀘어 네오 Regular"/>
+                <w:b w:val="0"/>
                 <w:sz w:val="18"/>
               </w:rPr>
               <w:t>progress.md</w:t>
@@ -538,6 +588,8 @@
             <w:r/>
             <w:r>
               <w:rPr>
+                <w:rFonts w:ascii="나눔스퀘어 네오 Regular" w:hAnsi="나눔스퀘어 네오 Regular" w:eastAsia="나눔스퀘어 네오 Regular"/>
+                <w:b w:val="0"/>
                 <w:sz w:val="18"/>
               </w:rPr>
               <w:t>전체 실험·검증 기록(§1~§217): 시도, 기각, 정정까지 시간순으로 기록</w:t>
@@ -552,6 +604,7 @@
       </w:pPr>
       <w:r>
         <w:rPr>
+          <w:rFonts w:ascii="나눔스퀘어 네오 Regular" w:hAnsi="나눔스퀘어 네오 Regular" w:eastAsia="나눔스퀘어 네오 Regular"/>
           <w:b w:val="0"/>
           <w:sz w:val="8"/>
         </w:rPr>
@@ -563,7 +616,8 @@
       </w:pPr>
       <w:r>
         <w:rPr>
-          <w:b/>
+          <w:rFonts w:ascii="나눔스퀘어 네오 Bold" w:hAnsi="나눔스퀘어 네오 Bold" w:eastAsia="나눔스퀘어 네오 Bold"/>
+          <w:b w:val="0"/>
           <w:color w:val="1B2630"/>
           <w:sz w:val="23"/>
         </w:rPr>
@@ -576,6 +630,7 @@
       </w:pPr>
       <w:r>
         <w:rPr>
+          <w:rFonts w:ascii="나눔스퀘어 네오 Regular" w:hAnsi="나눔스퀘어 네오 Regular" w:eastAsia="나눔스퀘어 네오 Regular"/>
           <w:b w:val="0"/>
           <w:sz w:val="18"/>
         </w:rPr>
@@ -588,6 +643,7 @@
       </w:pPr>
       <w:r>
         <w:rPr>
+          <w:rFonts w:ascii="나눔스퀘어 네오 Regular" w:hAnsi="나눔스퀘어 네오 Regular" w:eastAsia="나눔스퀘어 네오 Regular"/>
           <w:b w:val="0"/>
           <w:sz w:val="18"/>
         </w:rPr>
@@ -600,6 +656,7 @@
       </w:pPr>
       <w:r>
         <w:rPr>
+          <w:rFonts w:ascii="나눔스퀘어 네오 Regular" w:hAnsi="나눔스퀘어 네오 Regular" w:eastAsia="나눔스퀘어 네오 Regular"/>
           <w:b w:val="0"/>
           <w:sz w:val="18"/>
         </w:rPr>
@@ -612,7 +669,8 @@
       </w:pPr>
       <w:r>
         <w:rPr>
-          <w:b/>
+          <w:rFonts w:ascii="나눔스퀘어 네오 Bold" w:hAnsi="나눔스퀘어 네오 Bold" w:eastAsia="나눔스퀘어 네오 Bold"/>
+          <w:b w:val="0"/>
           <w:color w:val="1B2630"/>
           <w:sz w:val="23"/>
         </w:rPr>
@@ -626,6 +684,8 @@
       </w:pPr>
       <w:r>
         <w:rPr>
+          <w:rFonts w:ascii="나눔스퀘어 네오 Regular" w:hAnsi="나눔스퀘어 네오 Regular" w:eastAsia="나눔스퀘어 네오 Regular"/>
+          <w:b w:val="0"/>
           <w:sz w:val="18"/>
         </w:rPr>
         <w:t>대용량 원본 데이터(UZH shapes_rotation 약 500 MB, 센서 .dvs/.h5)와 대회 Q&amp;A 자료는 제출 폴더에서 제외했습니다.</w:t>
@@ -638,6 +698,8 @@
       </w:pPr>
       <w:r>
         <w:rPr>
+          <w:rFonts w:ascii="나눔스퀘어 네오 Regular" w:hAnsi="나눔스퀘어 네오 Regular" w:eastAsia="나눔스퀘어 네오 Regular"/>
+          <w:b w:val="0"/>
           <w:sz w:val="18"/>
         </w:rPr>
         <w:t>프로젝트 전체 이력은 https://github.com/GangHeeJo/AI-SEMI (main)에서 확인할 수 있습니다.</w:t>
@@ -650,6 +712,8 @@
       </w:pPr>
       <w:r>
         <w:rPr>
+          <w:rFonts w:ascii="나눔스퀘어 네오 Regular" w:hAnsi="나눔스퀘어 네오 Regular" w:eastAsia="나눔스퀘어 네오 Regular"/>
+          <w:b w:val="0"/>
           <w:sz w:val="18"/>
         </w:rPr>
         <w:t>설계 조건: GPDK045 교육용 PDK, 클록 5 ns, 입출력 지연 0.25 ns, uncertainty 0.10 ns (팀 공통 SDC).</w:t>
@@ -1032,7 +1096,7 @@
       <w:spacing w:after="60"/>
     </w:pPr>
     <w:rPr>
-      <w:rFonts w:ascii="NanumSquare Neo" w:hAnsi="NanumSquare Neo" w:eastAsia="NanumSquare Neo"/>
+      <w:rFonts w:ascii="나눔스퀘어 네오 Regular" w:hAnsi="나눔스퀘어 네오 Regular" w:eastAsia="나눔스퀘어 네오 Regular"/>
       <w:sz w:val="20"/>
     </w:rPr>
   </w:style>

</xml_diff>